<commit_message>
Clarify chapter 2 formulas
</commit_message>
<xml_diff>
--- a/第二章节优化扩写稿.docx
+++ b/第二章节优化扩写稿.docx
@@ -232,7 +232,7 @@
           <w:rFonts w:ascii="宋体" w:hAnsi="宋体" w:eastAsia="宋体"/>
           <w:sz w:val="24"/>
         </w:rPr>
-        <w:t>α = w / (Wpix cosθ)                         （2-1）</w:t>
+        <w:t>α = w / (Wpix × cosθ)                         （2-1）</w:t>
       </w:r>
     </w:p>
     <w:p>
@@ -722,7 +722,7 @@
           <w:rFonts w:ascii="宋体" w:hAnsi="宋体" w:eastAsia="宋体"/>
           <w:sz w:val="24"/>
         </w:rPr>
-        <w:t>δR/R = √Σ[(∂R/∂Xi · δXi/R)^2]                         （2-6）</w:t>
+        <w:t>δR/R = √Σ(i=1 to N)[(∂R/∂Xi · δXi/R)^2]                         （2-6）</w:t>
       </w:r>
     </w:p>
     <w:p>

</xml_diff>